<commit_message>
usando o streamlit - apenas ajustei os modelos em Word.
</commit_message>
<xml_diff>
--- a/modelos/modelo_conclusao.docx
+++ b/modelos/modelo_conclusao.docx
@@ -1,6 +1,6 @@
 
 <file path=word/document.xml><?xml version="1.0" encoding="utf-8"?>
-<w:document xmlns:wpc="http://schemas.microsoft.com/office/word/2010/wordprocessingCanvas" xmlns:cx="http://schemas.microsoft.com/office/drawing/2014/chartex" xmlns:cx1="http://schemas.microsoft.com/office/drawing/2015/9/8/chartex" xmlns:cx2="http://schemas.microsoft.com/office/drawing/2015/10/21/chartex" xmlns:cx3="http://schemas.microsoft.com/office/drawing/2016/5/9/chartex" xmlns:cx4="http://schemas.microsoft.com/office/drawing/2016/5/10/chartex" xmlns:cx5="http://schemas.microsoft.com/office/drawing/2016/5/11/chartex" xmlns:cx6="http://schemas.microsoft.com/office/drawing/2016/5/12/chartex" xmlns:cx7="http://schemas.microsoft.com/office/drawing/2016/5/13/chartex" xmlns:cx8="http://schemas.microsoft.com/office/drawing/2016/5/14/chartex" xmlns:mc="http://schemas.openxmlformats.org/markup-compatibility/2006" xmlns:aink="http://schemas.microsoft.com/office/drawing/2016/ink" xmlns:am3d="http://schemas.microsoft.com/office/drawing/2017/model3d" xmlns:o="urn:schemas-microsoft-com:office:office" xmlns:oel="http://schemas.microsoft.com/office/2019/extlst" xmlns:r="http://schemas.openxmlformats.org/officeDocument/2006/relationships" xmlns:m="http://schemas.openxmlformats.org/officeDocument/2006/math" xmlns:v="urn:schemas-microsoft-com:vml" xmlns:wp14="http://schemas.microsoft.com/office/word/2010/wordprocessingDrawing" xmlns:wp="http://schemas.openxmlformats.org/drawingml/2006/wordprocessingDrawing" xmlns:w10="urn:schemas-microsoft-com:office:word" xmlns:w="http://schemas.openxmlformats.org/wordprocessingml/2006/main" xmlns:w14="http://schemas.microsoft.com/office/word/2010/wordml" xmlns:w15="http://schemas.microsoft.com/office/word/2012/wordml" xmlns:w16cex="http://schemas.microsoft.com/office/word/2018/wordml/cex" xmlns:w16cid="http://schemas.microsoft.com/office/word/2016/wordml/cid" xmlns:w16="http://schemas.microsoft.com/office/word/2018/wordml" xmlns:w16du="http://schemas.microsoft.com/office/word/2023/wordml/word16du" xmlns:w16sdtdh="http://schemas.microsoft.com/office/word/2020/wordml/sdtdatahash" xmlns:w16sdtfl="http://schemas.microsoft.com/office/word/2024/wordml/sdtformatlock" xmlns:w16se="http://schemas.microsoft.com/office/word/2015/wordml/symex" xmlns:wpg="http://schemas.microsoft.com/office/word/2010/wordprocessingGroup" xmlns:wpi="http://schemas.microsoft.com/office/word/2010/wordprocessingInk" xmlns:wne="http://schemas.microsoft.com/office/word/2006/wordml" xmlns:wps="http://schemas.microsoft.com/office/word/2010/wordprocessingShape" mc:Ignorable="w14 w15 w16se w16cid w16 w16cex w16sdtdh w16sdtfl w16du wp14">
+<w:document xmlns:wpc="http://schemas.microsoft.com/office/word/2010/wordprocessingCanvas" xmlns:cx="http://schemas.microsoft.com/office/drawing/2014/chartex" xmlns:cx1="http://schemas.microsoft.com/office/drawing/2015/9/8/chartex" xmlns:cx2="http://schemas.microsoft.com/office/drawing/2015/10/21/chartex" xmlns:cx3="http://schemas.microsoft.com/office/drawing/2016/5/9/chartex" xmlns:cx4="http://schemas.microsoft.com/office/drawing/2016/5/10/chartex" xmlns:cx5="http://schemas.microsoft.com/office/drawing/2016/5/11/chartex" xmlns:cx6="http://schemas.microsoft.com/office/drawing/2016/5/12/chartex" xmlns:cx7="http://schemas.microsoft.com/office/drawing/2016/5/13/chartex" xmlns:cx8="http://schemas.microsoft.com/office/drawing/2016/5/14/chartex" xmlns:mc="http://schemas.openxmlformats.org/markup-compatibility/2006" xmlns:aink="http://schemas.microsoft.com/office/drawing/2016/ink" xmlns:am3d="http://schemas.microsoft.com/office/drawing/2017/model3d" xmlns:o="urn:schemas-microsoft-com:office:office" xmlns:oel="http://schemas.microsoft.com/office/2019/extlst" xmlns:r="http://schemas.openxmlformats.org/officeDocument/2006/relationships" xmlns:m="http://schemas.openxmlformats.org/officeDocument/2006/math" xmlns:v="urn:schemas-microsoft-com:vml" xmlns:wp14="http://schemas.microsoft.com/office/word/2010/wordprocessingDrawing" xmlns:wp="http://schemas.openxmlformats.org/drawingml/2006/wordprocessingDrawing" xmlns:w10="urn:schemas-microsoft-com:office:word" xmlns:w="http://schemas.openxmlformats.org/wordprocessingml/2006/main" xmlns:w14="http://schemas.microsoft.com/office/word/2010/wordml" xmlns:w15="http://schemas.microsoft.com/office/word/2012/wordml" xmlns:w16cei="http://schemas.microsoft.com/office/word/2026/wordml/cei" xmlns:w16cex="http://schemas.microsoft.com/office/word/2018/wordml/cex" xmlns:w16cid="http://schemas.microsoft.com/office/word/2016/wordml/cid" xmlns:w16="http://schemas.microsoft.com/office/word/2018/wordml" xmlns:w16du="http://schemas.microsoft.com/office/word/2023/wordml/word16du" xmlns:w16sdtdh="http://schemas.microsoft.com/office/word/2020/wordml/sdtdatahash" xmlns:w16sdtfl="http://schemas.microsoft.com/office/word/2024/wordml/sdtformatlock" xmlns:w16se="http://schemas.microsoft.com/office/word/2015/wordml/symex" xmlns:wpg="http://schemas.microsoft.com/office/word/2010/wordprocessingGroup" xmlns:wpi="http://schemas.microsoft.com/office/word/2010/wordprocessingInk" xmlns:wne="http://schemas.microsoft.com/office/word/2006/wordml" xmlns:wps="http://schemas.microsoft.com/office/word/2010/wordprocessingShape" mc:Ignorable="w14 w15 w16se w16cid w16 w16cex w16sdtdh w16sdtfl w16du wp14">
   <w:body>
     <w:p>
       <w:pPr>
@@ -19,16 +19,6 @@
         </w:rPr>
         <w:t>III – CONCLUSÃO</w:t>
       </w:r>
-    </w:p>
-    <w:p>
-      <w:pPr>
-        <w:ind w:left="-142" w:right="71"/>
-        <w:jc w:val="both"/>
-        <w:rPr>
-          <w:rFonts w:ascii="Arial" w:hAnsi="Arial" w:cs="Arial"/>
-          <w:lang w:eastAsia="pt-BR"/>
-        </w:rPr>
-      </w:pPr>
     </w:p>
     <w:p>
       <w:pPr>
@@ -1099,8 +1089,18 @@
                 <w:b/>
                 <w:bCs/>
               </w:rPr>
-              <w:t>Lilian Behreing</w:t>
-            </w:r>
+              <w:t xml:space="preserve">Lilian </w:t>
+            </w:r>
+            <w:proofErr w:type="spellStart"/>
+            <w:r>
+              <w:rPr>
+                <w:rFonts w:ascii="Arial" w:hAnsi="Arial" w:cs="Arial"/>
+                <w:b/>
+                <w:bCs/>
+              </w:rPr>
+              <w:t>Behreing</w:t>
+            </w:r>
+            <w:proofErr w:type="spellEnd"/>
           </w:p>
         </w:tc>
         <w:tc>
@@ -1229,14 +1229,34 @@
               </w:rPr>
               <w:t xml:space="preserve">Deputado </w:t>
             </w:r>
+            <w:proofErr w:type="spellStart"/>
             <w:r>
               <w:rPr>
                 <w:rFonts w:ascii="Arial" w:hAnsi="Arial" w:cs="Arial"/>
                 <w:b/>
                 <w:bCs/>
               </w:rPr>
-              <w:t>Danniel Librelon</w:t>
-            </w:r>
+              <w:t>Danniel</w:t>
+            </w:r>
+            <w:proofErr w:type="spellEnd"/>
+            <w:r>
+              <w:rPr>
+                <w:rFonts w:ascii="Arial" w:hAnsi="Arial" w:cs="Arial"/>
+                <w:b/>
+                <w:bCs/>
+              </w:rPr>
+              <w:t xml:space="preserve"> </w:t>
+            </w:r>
+            <w:proofErr w:type="spellStart"/>
+            <w:r>
+              <w:rPr>
+                <w:rFonts w:ascii="Arial" w:hAnsi="Arial" w:cs="Arial"/>
+                <w:b/>
+                <w:bCs/>
+              </w:rPr>
+              <w:t>Librelon</w:t>
+            </w:r>
+            <w:proofErr w:type="spellEnd"/>
           </w:p>
         </w:tc>
         <w:tc>
@@ -1282,7 +1302,7 @@
 </file>
 
 <file path=word/endnotes.xml><?xml version="1.0" encoding="utf-8"?>
-<w:endnotes xmlns:wpc="http://schemas.microsoft.com/office/word/2010/wordprocessingCanvas" xmlns:cx="http://schemas.microsoft.com/office/drawing/2014/chartex" xmlns:cx1="http://schemas.microsoft.com/office/drawing/2015/9/8/chartex" xmlns:cx2="http://schemas.microsoft.com/office/drawing/2015/10/21/chartex" xmlns:cx3="http://schemas.microsoft.com/office/drawing/2016/5/9/chartex" xmlns:cx4="http://schemas.microsoft.com/office/drawing/2016/5/10/chartex" xmlns:cx5="http://schemas.microsoft.com/office/drawing/2016/5/11/chartex" xmlns:cx6="http://schemas.microsoft.com/office/drawing/2016/5/12/chartex" xmlns:cx7="http://schemas.microsoft.com/office/drawing/2016/5/13/chartex" xmlns:cx8="http://schemas.microsoft.com/office/drawing/2016/5/14/chartex" xmlns:mc="http://schemas.openxmlformats.org/markup-compatibility/2006" xmlns:aink="http://schemas.microsoft.com/office/drawing/2016/ink" xmlns:am3d="http://schemas.microsoft.com/office/drawing/2017/model3d" xmlns:o="urn:schemas-microsoft-com:office:office" xmlns:oel="http://schemas.microsoft.com/office/2019/extlst" xmlns:r="http://schemas.openxmlformats.org/officeDocument/2006/relationships" xmlns:m="http://schemas.openxmlformats.org/officeDocument/2006/math" xmlns:v="urn:schemas-microsoft-com:vml" xmlns:wp14="http://schemas.microsoft.com/office/word/2010/wordprocessingDrawing" xmlns:wp="http://schemas.openxmlformats.org/drawingml/2006/wordprocessingDrawing" xmlns:w10="urn:schemas-microsoft-com:office:word" xmlns:w="http://schemas.openxmlformats.org/wordprocessingml/2006/main" xmlns:w14="http://schemas.microsoft.com/office/word/2010/wordml" xmlns:w15="http://schemas.microsoft.com/office/word/2012/wordml" xmlns:w16cex="http://schemas.microsoft.com/office/word/2018/wordml/cex" xmlns:w16cid="http://schemas.microsoft.com/office/word/2016/wordml/cid" xmlns:w16="http://schemas.microsoft.com/office/word/2018/wordml" xmlns:w16du="http://schemas.microsoft.com/office/word/2023/wordml/word16du" xmlns:w16sdtdh="http://schemas.microsoft.com/office/word/2020/wordml/sdtdatahash" xmlns:w16sdtfl="http://schemas.microsoft.com/office/word/2024/wordml/sdtformatlock" xmlns:w16se="http://schemas.microsoft.com/office/word/2015/wordml/symex" xmlns:wpg="http://schemas.microsoft.com/office/word/2010/wordprocessingGroup" xmlns:wpi="http://schemas.microsoft.com/office/word/2010/wordprocessingInk" xmlns:wne="http://schemas.microsoft.com/office/word/2006/wordml" xmlns:wps="http://schemas.microsoft.com/office/word/2010/wordprocessingShape" mc:Ignorable="w14 w15 w16se w16cid w16 w16cex w16sdtdh w16sdtfl w16du wp14">
+<w:endnotes xmlns:wpc="http://schemas.microsoft.com/office/word/2010/wordprocessingCanvas" xmlns:cx="http://schemas.microsoft.com/office/drawing/2014/chartex" xmlns:cx1="http://schemas.microsoft.com/office/drawing/2015/9/8/chartex" xmlns:cx2="http://schemas.microsoft.com/office/drawing/2015/10/21/chartex" xmlns:cx3="http://schemas.microsoft.com/office/drawing/2016/5/9/chartex" xmlns:cx4="http://schemas.microsoft.com/office/drawing/2016/5/10/chartex" xmlns:cx5="http://schemas.microsoft.com/office/drawing/2016/5/11/chartex" xmlns:cx6="http://schemas.microsoft.com/office/drawing/2016/5/12/chartex" xmlns:cx7="http://schemas.microsoft.com/office/drawing/2016/5/13/chartex" xmlns:cx8="http://schemas.microsoft.com/office/drawing/2016/5/14/chartex" xmlns:mc="http://schemas.openxmlformats.org/markup-compatibility/2006" xmlns:aink="http://schemas.microsoft.com/office/drawing/2016/ink" xmlns:am3d="http://schemas.microsoft.com/office/drawing/2017/model3d" xmlns:o="urn:schemas-microsoft-com:office:office" xmlns:oel="http://schemas.microsoft.com/office/2019/extlst" xmlns:r="http://schemas.openxmlformats.org/officeDocument/2006/relationships" xmlns:m="http://schemas.openxmlformats.org/officeDocument/2006/math" xmlns:v="urn:schemas-microsoft-com:vml" xmlns:wp14="http://schemas.microsoft.com/office/word/2010/wordprocessingDrawing" xmlns:wp="http://schemas.openxmlformats.org/drawingml/2006/wordprocessingDrawing" xmlns:w10="urn:schemas-microsoft-com:office:word" xmlns:w="http://schemas.openxmlformats.org/wordprocessingml/2006/main" xmlns:w14="http://schemas.microsoft.com/office/word/2010/wordml" xmlns:w15="http://schemas.microsoft.com/office/word/2012/wordml" xmlns:w16cei="http://schemas.microsoft.com/office/word/2026/wordml/cei" xmlns:w16cex="http://schemas.microsoft.com/office/word/2018/wordml/cex" xmlns:w16cid="http://schemas.microsoft.com/office/word/2016/wordml/cid" xmlns:w16="http://schemas.microsoft.com/office/word/2018/wordml" xmlns:w16du="http://schemas.microsoft.com/office/word/2023/wordml/word16du" xmlns:w16sdtdh="http://schemas.microsoft.com/office/word/2020/wordml/sdtdatahash" xmlns:w16sdtfl="http://schemas.microsoft.com/office/word/2024/wordml/sdtformatlock" xmlns:w16se="http://schemas.microsoft.com/office/word/2015/wordml/symex" xmlns:wpg="http://schemas.microsoft.com/office/word/2010/wordprocessingGroup" xmlns:wpi="http://schemas.microsoft.com/office/word/2010/wordprocessingInk" xmlns:wne="http://schemas.microsoft.com/office/word/2006/wordml" xmlns:wps="http://schemas.microsoft.com/office/word/2010/wordprocessingShape" mc:Ignorable="w14 w15 w16se w16cid w16 w16cex w16sdtdh w16sdtfl w16du wp14">
   <w:endnote w:type="separator" w:id="-1">
     <w:p>
       <w:r>
@@ -1304,7 +1324,7 @@
 </file>
 
 <file path=word/footnotes.xml><?xml version="1.0" encoding="utf-8"?>
-<w:footnotes xmlns:wpc="http://schemas.microsoft.com/office/word/2010/wordprocessingCanvas" xmlns:cx="http://schemas.microsoft.com/office/drawing/2014/chartex" xmlns:cx1="http://schemas.microsoft.com/office/drawing/2015/9/8/chartex" xmlns:cx2="http://schemas.microsoft.com/office/drawing/2015/10/21/chartex" xmlns:cx3="http://schemas.microsoft.com/office/drawing/2016/5/9/chartex" xmlns:cx4="http://schemas.microsoft.com/office/drawing/2016/5/10/chartex" xmlns:cx5="http://schemas.microsoft.com/office/drawing/2016/5/11/chartex" xmlns:cx6="http://schemas.microsoft.com/office/drawing/2016/5/12/chartex" xmlns:cx7="http://schemas.microsoft.com/office/drawing/2016/5/13/chartex" xmlns:cx8="http://schemas.microsoft.com/office/drawing/2016/5/14/chartex" xmlns:mc="http://schemas.openxmlformats.org/markup-compatibility/2006" xmlns:aink="http://schemas.microsoft.com/office/drawing/2016/ink" xmlns:am3d="http://schemas.microsoft.com/office/drawing/2017/model3d" xmlns:o="urn:schemas-microsoft-com:office:office" xmlns:oel="http://schemas.microsoft.com/office/2019/extlst" xmlns:r="http://schemas.openxmlformats.org/officeDocument/2006/relationships" xmlns:m="http://schemas.openxmlformats.org/officeDocument/2006/math" xmlns:v="urn:schemas-microsoft-com:vml" xmlns:wp14="http://schemas.microsoft.com/office/word/2010/wordprocessingDrawing" xmlns:wp="http://schemas.openxmlformats.org/drawingml/2006/wordprocessingDrawing" xmlns:w10="urn:schemas-microsoft-com:office:word" xmlns:w="http://schemas.openxmlformats.org/wordprocessingml/2006/main" xmlns:w14="http://schemas.microsoft.com/office/word/2010/wordml" xmlns:w15="http://schemas.microsoft.com/office/word/2012/wordml" xmlns:w16cex="http://schemas.microsoft.com/office/word/2018/wordml/cex" xmlns:w16cid="http://schemas.microsoft.com/office/word/2016/wordml/cid" xmlns:w16="http://schemas.microsoft.com/office/word/2018/wordml" xmlns:w16du="http://schemas.microsoft.com/office/word/2023/wordml/word16du" xmlns:w16sdtdh="http://schemas.microsoft.com/office/word/2020/wordml/sdtdatahash" xmlns:w16sdtfl="http://schemas.microsoft.com/office/word/2024/wordml/sdtformatlock" xmlns:w16se="http://schemas.microsoft.com/office/word/2015/wordml/symex" xmlns:wpg="http://schemas.microsoft.com/office/word/2010/wordprocessingGroup" xmlns:wpi="http://schemas.microsoft.com/office/word/2010/wordprocessingInk" xmlns:wne="http://schemas.microsoft.com/office/word/2006/wordml" xmlns:wps="http://schemas.microsoft.com/office/word/2010/wordprocessingShape" mc:Ignorable="w14 w15 w16se w16cid w16 w16cex w16sdtdh w16sdtfl w16du wp14">
+<w:footnotes xmlns:wpc="http://schemas.microsoft.com/office/word/2010/wordprocessingCanvas" xmlns:cx="http://schemas.microsoft.com/office/drawing/2014/chartex" xmlns:cx1="http://schemas.microsoft.com/office/drawing/2015/9/8/chartex" xmlns:cx2="http://schemas.microsoft.com/office/drawing/2015/10/21/chartex" xmlns:cx3="http://schemas.microsoft.com/office/drawing/2016/5/9/chartex" xmlns:cx4="http://schemas.microsoft.com/office/drawing/2016/5/10/chartex" xmlns:cx5="http://schemas.microsoft.com/office/drawing/2016/5/11/chartex" xmlns:cx6="http://schemas.microsoft.com/office/drawing/2016/5/12/chartex" xmlns:cx7="http://schemas.microsoft.com/office/drawing/2016/5/13/chartex" xmlns:cx8="http://schemas.microsoft.com/office/drawing/2016/5/14/chartex" xmlns:mc="http://schemas.openxmlformats.org/markup-compatibility/2006" xmlns:aink="http://schemas.microsoft.com/office/drawing/2016/ink" xmlns:am3d="http://schemas.microsoft.com/office/drawing/2017/model3d" xmlns:o="urn:schemas-microsoft-com:office:office" xmlns:oel="http://schemas.microsoft.com/office/2019/extlst" xmlns:r="http://schemas.openxmlformats.org/officeDocument/2006/relationships" xmlns:m="http://schemas.openxmlformats.org/officeDocument/2006/math" xmlns:v="urn:schemas-microsoft-com:vml" xmlns:wp14="http://schemas.microsoft.com/office/word/2010/wordprocessingDrawing" xmlns:wp="http://schemas.openxmlformats.org/drawingml/2006/wordprocessingDrawing" xmlns:w10="urn:schemas-microsoft-com:office:word" xmlns:w="http://schemas.openxmlformats.org/wordprocessingml/2006/main" xmlns:w14="http://schemas.microsoft.com/office/word/2010/wordml" xmlns:w15="http://schemas.microsoft.com/office/word/2012/wordml" xmlns:w16cei="http://schemas.microsoft.com/office/word/2026/wordml/cei" xmlns:w16cex="http://schemas.microsoft.com/office/word/2018/wordml/cex" xmlns:w16cid="http://schemas.microsoft.com/office/word/2016/wordml/cid" xmlns:w16="http://schemas.microsoft.com/office/word/2018/wordml" xmlns:w16du="http://schemas.microsoft.com/office/word/2023/wordml/word16du" xmlns:w16sdtdh="http://schemas.microsoft.com/office/word/2020/wordml/sdtdatahash" xmlns:w16sdtfl="http://schemas.microsoft.com/office/word/2024/wordml/sdtformatlock" xmlns:w16se="http://schemas.microsoft.com/office/word/2015/wordml/symex" xmlns:wpg="http://schemas.microsoft.com/office/word/2010/wordprocessingGroup" xmlns:wpi="http://schemas.microsoft.com/office/word/2010/wordprocessingInk" xmlns:wne="http://schemas.microsoft.com/office/word/2006/wordml" xmlns:wps="http://schemas.microsoft.com/office/word/2010/wordprocessingShape" mc:Ignorable="w14 w15 w16se w16cid w16 w16cex w16sdtdh w16sdtfl w16du wp14">
   <w:footnote w:type="separator" w:id="-1">
     <w:p>
       <w:r>
@@ -1326,7 +1346,7 @@
 </file>
 
 <file path=word/header1.xml><?xml version="1.0" encoding="utf-8"?>
-<w:hdr xmlns:wpc="http://schemas.microsoft.com/office/word/2010/wordprocessingCanvas" xmlns:cx="http://schemas.microsoft.com/office/drawing/2014/chartex" xmlns:cx1="http://schemas.microsoft.com/office/drawing/2015/9/8/chartex" xmlns:cx2="http://schemas.microsoft.com/office/drawing/2015/10/21/chartex" xmlns:cx3="http://schemas.microsoft.com/office/drawing/2016/5/9/chartex" xmlns:cx4="http://schemas.microsoft.com/office/drawing/2016/5/10/chartex" xmlns:cx5="http://schemas.microsoft.com/office/drawing/2016/5/11/chartex" xmlns:cx6="http://schemas.microsoft.com/office/drawing/2016/5/12/chartex" xmlns:cx7="http://schemas.microsoft.com/office/drawing/2016/5/13/chartex" xmlns:cx8="http://schemas.microsoft.com/office/drawing/2016/5/14/chartex" xmlns:mc="http://schemas.openxmlformats.org/markup-compatibility/2006" xmlns:aink="http://schemas.microsoft.com/office/drawing/2016/ink" xmlns:am3d="http://schemas.microsoft.com/office/drawing/2017/model3d" xmlns:o="urn:schemas-microsoft-com:office:office" xmlns:oel="http://schemas.microsoft.com/office/2019/extlst" xmlns:r="http://schemas.openxmlformats.org/officeDocument/2006/relationships" xmlns:m="http://schemas.openxmlformats.org/officeDocument/2006/math" xmlns:v="urn:schemas-microsoft-com:vml" xmlns:wp14="http://schemas.microsoft.com/office/word/2010/wordprocessingDrawing" xmlns:wp="http://schemas.openxmlformats.org/drawingml/2006/wordprocessingDrawing" xmlns:w10="urn:schemas-microsoft-com:office:word" xmlns:w="http://schemas.openxmlformats.org/wordprocessingml/2006/main" xmlns:w14="http://schemas.microsoft.com/office/word/2010/wordml" xmlns:w15="http://schemas.microsoft.com/office/word/2012/wordml" xmlns:w16cex="http://schemas.microsoft.com/office/word/2018/wordml/cex" xmlns:w16cid="http://schemas.microsoft.com/office/word/2016/wordml/cid" xmlns:w16="http://schemas.microsoft.com/office/word/2018/wordml" xmlns:w16du="http://schemas.microsoft.com/office/word/2023/wordml/word16du" xmlns:w16sdtdh="http://schemas.microsoft.com/office/word/2020/wordml/sdtdatahash" xmlns:w16sdtfl="http://schemas.microsoft.com/office/word/2024/wordml/sdtformatlock" xmlns:w16se="http://schemas.microsoft.com/office/word/2015/wordml/symex" xmlns:wpg="http://schemas.microsoft.com/office/word/2010/wordprocessingGroup" xmlns:wpi="http://schemas.microsoft.com/office/word/2010/wordprocessingInk" xmlns:wne="http://schemas.microsoft.com/office/word/2006/wordml" xmlns:wps="http://schemas.microsoft.com/office/word/2010/wordprocessingShape" mc:Ignorable="w14 w15 w16se w16cid w16 w16cex w16sdtdh w16sdtfl w16du wp14">
+<w:hdr xmlns:wpc="http://schemas.microsoft.com/office/word/2010/wordprocessingCanvas" xmlns:cx="http://schemas.microsoft.com/office/drawing/2014/chartex" xmlns:cx1="http://schemas.microsoft.com/office/drawing/2015/9/8/chartex" xmlns:cx2="http://schemas.microsoft.com/office/drawing/2015/10/21/chartex" xmlns:cx3="http://schemas.microsoft.com/office/drawing/2016/5/9/chartex" xmlns:cx4="http://schemas.microsoft.com/office/drawing/2016/5/10/chartex" xmlns:cx5="http://schemas.microsoft.com/office/drawing/2016/5/11/chartex" xmlns:cx6="http://schemas.microsoft.com/office/drawing/2016/5/12/chartex" xmlns:cx7="http://schemas.microsoft.com/office/drawing/2016/5/13/chartex" xmlns:cx8="http://schemas.microsoft.com/office/drawing/2016/5/14/chartex" xmlns:mc="http://schemas.openxmlformats.org/markup-compatibility/2006" xmlns:aink="http://schemas.microsoft.com/office/drawing/2016/ink" xmlns:am3d="http://schemas.microsoft.com/office/drawing/2017/model3d" xmlns:o="urn:schemas-microsoft-com:office:office" xmlns:oel="http://schemas.microsoft.com/office/2019/extlst" xmlns:r="http://schemas.openxmlformats.org/officeDocument/2006/relationships" xmlns:m="http://schemas.openxmlformats.org/officeDocument/2006/math" xmlns:v="urn:schemas-microsoft-com:vml" xmlns:wp14="http://schemas.microsoft.com/office/word/2010/wordprocessingDrawing" xmlns:wp="http://schemas.openxmlformats.org/drawingml/2006/wordprocessingDrawing" xmlns:w10="urn:schemas-microsoft-com:office:word" xmlns:w="http://schemas.openxmlformats.org/wordprocessingml/2006/main" xmlns:w14="http://schemas.microsoft.com/office/word/2010/wordml" xmlns:w15="http://schemas.microsoft.com/office/word/2012/wordml" xmlns:w16cei="http://schemas.microsoft.com/office/word/2026/wordml/cei" xmlns:w16cex="http://schemas.microsoft.com/office/word/2018/wordml/cex" xmlns:w16cid="http://schemas.microsoft.com/office/word/2016/wordml/cid" xmlns:w16="http://schemas.microsoft.com/office/word/2018/wordml" xmlns:w16du="http://schemas.microsoft.com/office/word/2023/wordml/word16du" xmlns:w16sdtdh="http://schemas.microsoft.com/office/word/2020/wordml/sdtdatahash" xmlns:w16sdtfl="http://schemas.microsoft.com/office/word/2024/wordml/sdtformatlock" xmlns:w16se="http://schemas.microsoft.com/office/word/2015/wordml/symex" xmlns:wpg="http://schemas.microsoft.com/office/word/2010/wordprocessingGroup" xmlns:wpi="http://schemas.microsoft.com/office/word/2010/wordprocessingInk" xmlns:wne="http://schemas.microsoft.com/office/word/2006/wordml" xmlns:wps="http://schemas.microsoft.com/office/word/2010/wordprocessingShape" mc:Ignorable="w14 w15 w16se w16cid w16 w16cex w16sdtdh w16sdtfl w16du wp14">
   <w:p>
     <w:pPr>
       <w:pStyle w:val="Cabealho"/>
@@ -1373,7 +1393,7 @@
 </file>
 
 <file path=word/numbering.xml><?xml version="1.0" encoding="utf-8"?>
-<w:numbering xmlns:wpc="http://schemas.microsoft.com/office/word/2010/wordprocessingCanvas" xmlns:cx="http://schemas.microsoft.com/office/drawing/2014/chartex" xmlns:cx1="http://schemas.microsoft.com/office/drawing/2015/9/8/chartex" xmlns:cx2="http://schemas.microsoft.com/office/drawing/2015/10/21/chartex" xmlns:cx3="http://schemas.microsoft.com/office/drawing/2016/5/9/chartex" xmlns:cx4="http://schemas.microsoft.com/office/drawing/2016/5/10/chartex" xmlns:cx5="http://schemas.microsoft.com/office/drawing/2016/5/11/chartex" xmlns:cx6="http://schemas.microsoft.com/office/drawing/2016/5/12/chartex" xmlns:cx7="http://schemas.microsoft.com/office/drawing/2016/5/13/chartex" xmlns:cx8="http://schemas.microsoft.com/office/drawing/2016/5/14/chartex" xmlns:mc="http://schemas.openxmlformats.org/markup-compatibility/2006" xmlns:aink="http://schemas.microsoft.com/office/drawing/2016/ink" xmlns:am3d="http://schemas.microsoft.com/office/drawing/2017/model3d" xmlns:o="urn:schemas-microsoft-com:office:office" xmlns:oel="http://schemas.microsoft.com/office/2019/extlst" xmlns:r="http://schemas.openxmlformats.org/officeDocument/2006/relationships" xmlns:m="http://schemas.openxmlformats.org/officeDocument/2006/math" xmlns:v="urn:schemas-microsoft-com:vml" xmlns:wp14="http://schemas.microsoft.com/office/word/2010/wordprocessingDrawing" xmlns:wp="http://schemas.openxmlformats.org/drawingml/2006/wordprocessingDrawing" xmlns:w10="urn:schemas-microsoft-com:office:word" xmlns:w="http://schemas.openxmlformats.org/wordprocessingml/2006/main" xmlns:w14="http://schemas.microsoft.com/office/word/2010/wordml" xmlns:w15="http://schemas.microsoft.com/office/word/2012/wordml" xmlns:w16cex="http://schemas.microsoft.com/office/word/2018/wordml/cex" xmlns:w16cid="http://schemas.microsoft.com/office/word/2016/wordml/cid" xmlns:w16="http://schemas.microsoft.com/office/word/2018/wordml" xmlns:w16du="http://schemas.microsoft.com/office/word/2023/wordml/word16du" xmlns:w16sdtdh="http://schemas.microsoft.com/office/word/2020/wordml/sdtdatahash" xmlns:w16sdtfl="http://schemas.microsoft.com/office/word/2024/wordml/sdtformatlock" xmlns:w16se="http://schemas.microsoft.com/office/word/2015/wordml/symex" xmlns:wpg="http://schemas.microsoft.com/office/word/2010/wordprocessingGroup" xmlns:wpi="http://schemas.microsoft.com/office/word/2010/wordprocessingInk" xmlns:wne="http://schemas.microsoft.com/office/word/2006/wordml" xmlns:wps="http://schemas.microsoft.com/office/word/2010/wordprocessingShape" mc:Ignorable="w14 w15 w16se w16cid w16 w16cex w16sdtdh w16sdtfl w16du wp14">
+<w:numbering xmlns:wpc="http://schemas.microsoft.com/office/word/2010/wordprocessingCanvas" xmlns:cx="http://schemas.microsoft.com/office/drawing/2014/chartex" xmlns:cx1="http://schemas.microsoft.com/office/drawing/2015/9/8/chartex" xmlns:cx2="http://schemas.microsoft.com/office/drawing/2015/10/21/chartex" xmlns:cx3="http://schemas.microsoft.com/office/drawing/2016/5/9/chartex" xmlns:cx4="http://schemas.microsoft.com/office/drawing/2016/5/10/chartex" xmlns:cx5="http://schemas.microsoft.com/office/drawing/2016/5/11/chartex" xmlns:cx6="http://schemas.microsoft.com/office/drawing/2016/5/12/chartex" xmlns:cx7="http://schemas.microsoft.com/office/drawing/2016/5/13/chartex" xmlns:cx8="http://schemas.microsoft.com/office/drawing/2016/5/14/chartex" xmlns:mc="http://schemas.openxmlformats.org/markup-compatibility/2006" xmlns:aink="http://schemas.microsoft.com/office/drawing/2016/ink" xmlns:am3d="http://schemas.microsoft.com/office/drawing/2017/model3d" xmlns:o="urn:schemas-microsoft-com:office:office" xmlns:oel="http://schemas.microsoft.com/office/2019/extlst" xmlns:r="http://schemas.openxmlformats.org/officeDocument/2006/relationships" xmlns:m="http://schemas.openxmlformats.org/officeDocument/2006/math" xmlns:v="urn:schemas-microsoft-com:vml" xmlns:wp14="http://schemas.microsoft.com/office/word/2010/wordprocessingDrawing" xmlns:wp="http://schemas.openxmlformats.org/drawingml/2006/wordprocessingDrawing" xmlns:w10="urn:schemas-microsoft-com:office:word" xmlns:w="http://schemas.openxmlformats.org/wordprocessingml/2006/main" xmlns:w14="http://schemas.microsoft.com/office/word/2010/wordml" xmlns:w15="http://schemas.microsoft.com/office/word/2012/wordml" xmlns:w16cei="http://schemas.microsoft.com/office/word/2026/wordml/cei" xmlns:w16cex="http://schemas.microsoft.com/office/word/2018/wordml/cex" xmlns:w16cid="http://schemas.microsoft.com/office/word/2016/wordml/cid" xmlns:w16="http://schemas.microsoft.com/office/word/2018/wordml" xmlns:w16du="http://schemas.microsoft.com/office/word/2023/wordml/word16du" xmlns:w16sdtdh="http://schemas.microsoft.com/office/word/2020/wordml/sdtdatahash" xmlns:w16sdtfl="http://schemas.microsoft.com/office/word/2024/wordml/sdtformatlock" xmlns:w16se="http://schemas.microsoft.com/office/word/2015/wordml/symex" xmlns:wpg="http://schemas.microsoft.com/office/word/2010/wordprocessingGroup" xmlns:wpi="http://schemas.microsoft.com/office/word/2010/wordprocessingInk" xmlns:wne="http://schemas.microsoft.com/office/word/2006/wordml" xmlns:wps="http://schemas.microsoft.com/office/word/2010/wordprocessingShape" mc:Ignorable="w14 w15 w16se w16cid w16 w16cex w16sdtdh w16sdtfl w16du wp14">
   <w:abstractNum w:abstractNumId="0" w15:restartNumberingAfterBreak="0">
     <w:nsid w:val="1A6C615E"/>
     <w:multiLevelType w:val="hybridMultilevel"/>
@@ -2679,6 +2699,69 @@
 </file>
 
 <file path=customXml/item1.xml><?xml version="1.0" encoding="utf-8"?>
+<?mso-contentType ?>
+<spe:Receivers xmlns:spe="http://schemas.microsoft.com/sharepoint/events">
+  <Receiver>
+    <Name>Document ID Generator</Name>
+    <Synchronization>Synchronous</Synchronization>
+    <Type>10001</Type>
+    <SequenceNumber>1000</SequenceNumber>
+    <Url/>
+    <Assembly>Microsoft.Office.DocumentManagement, Version=16.0.0.0, Culture=neutral, PublicKeyToken=71e9bce111e9429c</Assembly>
+    <Class>Microsoft.Office.DocumentManagement.Internal.DocIdHandler</Class>
+    <Data/>
+    <Filter/>
+  </Receiver>
+  <Receiver>
+    <Name>Document ID Generator</Name>
+    <Synchronization>Synchronous</Synchronization>
+    <Type>10002</Type>
+    <SequenceNumber>1001</SequenceNumber>
+    <Url/>
+    <Assembly>Microsoft.Office.DocumentManagement, Version=16.0.0.0, Culture=neutral, PublicKeyToken=71e9bce111e9429c</Assembly>
+    <Class>Microsoft.Office.DocumentManagement.Internal.DocIdHandler</Class>
+    <Data/>
+    <Filter/>
+  </Receiver>
+  <Receiver>
+    <Name>Document ID Generator</Name>
+    <Synchronization>Synchronous</Synchronization>
+    <Type>10004</Type>
+    <SequenceNumber>1002</SequenceNumber>
+    <Url/>
+    <Assembly>Microsoft.Office.DocumentManagement, Version=16.0.0.0, Culture=neutral, PublicKeyToken=71e9bce111e9429c</Assembly>
+    <Class>Microsoft.Office.DocumentManagement.Internal.DocIdHandler</Class>
+    <Data/>
+    <Filter/>
+  </Receiver>
+  <Receiver>
+    <Name>Document ID Generator</Name>
+    <Synchronization>Synchronous</Synchronization>
+    <Type>10006</Type>
+    <SequenceNumber>1003</SequenceNumber>
+    <Url/>
+    <Assembly>Microsoft.Office.DocumentManagement, Version=16.0.0.0, Culture=neutral, PublicKeyToken=71e9bce111e9429c</Assembly>
+    <Class>Microsoft.Office.DocumentManagement.Internal.DocIdHandler</Class>
+    <Data/>
+    <Filter/>
+  </Receiver>
+</spe:Receivers>
+</file>
+
+<file path=customXml/item2.xml><?xml version="1.0" encoding="utf-8"?>
+<?mso-contentType ?>
+<FormTemplates xmlns="http://schemas.microsoft.com/sharepoint/v3/contenttype/forms">
+  <Display>DocumentLibraryForm</Display>
+  <Edit>DocumentLibraryForm</Edit>
+  <New>DocumentLibraryForm</New>
+</FormTemplates>
+</file>
+
+<file path=customXml/item3.xml><?xml version="1.0" encoding="utf-8"?>
+<LongProperties xmlns="http://schemas.microsoft.com/office/2006/metadata/longProperties"/>
+</file>
+
+<file path=customXml/item4.xml><?xml version="1.0" encoding="utf-8"?>
 <ct:contentTypeSchema xmlns:ct="http://schemas.microsoft.com/office/2006/metadata/contentType" xmlns:ma="http://schemas.microsoft.com/office/2006/metadata/properties/metaAttributes" ct:_="" ma:_="" ma:contentTypeName="Documento" ma:contentTypeID="0x01010000A62BEBB571C447BFF9567365783643" ma:contentTypeVersion="1285" ma:contentTypeDescription="Crie um novo documento." ma:contentTypeScope="" ma:versionID="f9ca2b14fff2414319de074b6de36347">
   <xsd:schema xmlns:xsd="http://www.w3.org/2001/XMLSchema" xmlns:xs="http://www.w3.org/2001/XMLSchema" xmlns:p="http://schemas.microsoft.com/office/2006/metadata/properties" xmlns:ns2="b0724138-f138-4ee3-a235-b81b7efd62d3" xmlns:ns3="7d4e704b-cba0-42fd-b9f3-d4d5e0ecac5f" targetNamespace="http://schemas.microsoft.com/office/2006/metadata/properties" ma:root="true" ma:fieldsID="50e91b87311d80b886871170c24930db" ns2:_="" ns3:_="">
     <xsd:import namespace="b0724138-f138-4ee3-a235-b81b7efd62d3"/>
@@ -2946,69 +3029,6 @@
 </ct:contentTypeSchema>
 </file>
 
-<file path=customXml/item2.xml><?xml version="1.0" encoding="utf-8"?>
-<LongProperties xmlns="http://schemas.microsoft.com/office/2006/metadata/longProperties"/>
-</file>
-
-<file path=customXml/item3.xml><?xml version="1.0" encoding="utf-8"?>
-<?mso-contentType ?>
-<FormTemplates xmlns="http://schemas.microsoft.com/sharepoint/v3/contenttype/forms">
-  <Display>DocumentLibraryForm</Display>
-  <Edit>DocumentLibraryForm</Edit>
-  <New>DocumentLibraryForm</New>
-</FormTemplates>
-</file>
-
-<file path=customXml/item4.xml><?xml version="1.0" encoding="utf-8"?>
-<?mso-contentType ?>
-<spe:Receivers xmlns:spe="http://schemas.microsoft.com/sharepoint/events">
-  <Receiver>
-    <Name>Document ID Generator</Name>
-    <Synchronization>Synchronous</Synchronization>
-    <Type>10001</Type>
-    <SequenceNumber>1000</SequenceNumber>
-    <Url/>
-    <Assembly>Microsoft.Office.DocumentManagement, Version=16.0.0.0, Culture=neutral, PublicKeyToken=71e9bce111e9429c</Assembly>
-    <Class>Microsoft.Office.DocumentManagement.Internal.DocIdHandler</Class>
-    <Data/>
-    <Filter/>
-  </Receiver>
-  <Receiver>
-    <Name>Document ID Generator</Name>
-    <Synchronization>Synchronous</Synchronization>
-    <Type>10002</Type>
-    <SequenceNumber>1001</SequenceNumber>
-    <Url/>
-    <Assembly>Microsoft.Office.DocumentManagement, Version=16.0.0.0, Culture=neutral, PublicKeyToken=71e9bce111e9429c</Assembly>
-    <Class>Microsoft.Office.DocumentManagement.Internal.DocIdHandler</Class>
-    <Data/>
-    <Filter/>
-  </Receiver>
-  <Receiver>
-    <Name>Document ID Generator</Name>
-    <Synchronization>Synchronous</Synchronization>
-    <Type>10004</Type>
-    <SequenceNumber>1002</SequenceNumber>
-    <Url/>
-    <Assembly>Microsoft.Office.DocumentManagement, Version=16.0.0.0, Culture=neutral, PublicKeyToken=71e9bce111e9429c</Assembly>
-    <Class>Microsoft.Office.DocumentManagement.Internal.DocIdHandler</Class>
-    <Data/>
-    <Filter/>
-  </Receiver>
-  <Receiver>
-    <Name>Document ID Generator</Name>
-    <Synchronization>Synchronous</Synchronization>
-    <Type>10006</Type>
-    <SequenceNumber>1003</SequenceNumber>
-    <Url/>
-    <Assembly>Microsoft.Office.DocumentManagement, Version=16.0.0.0, Culture=neutral, PublicKeyToken=71e9bce111e9429c</Assembly>
-    <Class>Microsoft.Office.DocumentManagement.Internal.DocIdHandler</Class>
-    <Data/>
-    <Filter/>
-  </Receiver>
-</spe:Receivers>
-</file>
-
 <file path=customXml/item5.xml><?xml version="1.0" encoding="utf-8"?>
 <p:properties xmlns:p="http://schemas.microsoft.com/office/2006/metadata/properties" xmlns:xsi="http://www.w3.org/2001/XMLSchema-instance" xmlns:pc="http://schemas.microsoft.com/office/infopath/2007/PartnerControls">
   <documentManagement>
@@ -3026,6 +3046,30 @@
 </file>
 
 <file path=customXml/itemProps1.xml><?xml version="1.0" encoding="utf-8"?>
+<ds:datastoreItem xmlns:ds="http://schemas.openxmlformats.org/officeDocument/2006/customXml" ds:itemID="{98FB6D17-09F9-4F00-B34F-6196AA42767C}">
+  <ds:schemaRefs>
+    <ds:schemaRef ds:uri="http://schemas.microsoft.com/sharepoint/events"/>
+  </ds:schemaRefs>
+</ds:datastoreItem>
+</file>
+
+<file path=customXml/itemProps2.xml><?xml version="1.0" encoding="utf-8"?>
+<ds:datastoreItem xmlns:ds="http://schemas.openxmlformats.org/officeDocument/2006/customXml" ds:itemID="{7CDD3D26-A7DC-4560-A2CE-6E0F058E4981}">
+  <ds:schemaRefs>
+    <ds:schemaRef ds:uri="http://schemas.microsoft.com/sharepoint/v3/contenttype/forms"/>
+  </ds:schemaRefs>
+</ds:datastoreItem>
+</file>
+
+<file path=customXml/itemProps3.xml><?xml version="1.0" encoding="utf-8"?>
+<ds:datastoreItem xmlns:ds="http://schemas.openxmlformats.org/officeDocument/2006/customXml" ds:itemID="{93036CBA-D046-481A-8B9F-1275869D0315}">
+  <ds:schemaRefs>
+    <ds:schemaRef ds:uri="http://schemas.microsoft.com/office/2006/metadata/longProperties"/>
+  </ds:schemaRefs>
+</ds:datastoreItem>
+</file>
+
+<file path=customXml/itemProps4.xml><?xml version="1.0" encoding="utf-8"?>
 <ds:datastoreItem xmlns:ds="http://schemas.openxmlformats.org/officeDocument/2006/customXml" ds:itemID="{54B7C0C8-A25F-4DEE-BE47-23063106098A}">
   <ds:schemaRefs>
     <ds:schemaRef ds:uri="http://schemas.microsoft.com/office/2006/metadata/contentType"/>
@@ -3044,30 +3088,6 @@
 </ds:datastoreItem>
 </file>
 
-<file path=customXml/itemProps2.xml><?xml version="1.0" encoding="utf-8"?>
-<ds:datastoreItem xmlns:ds="http://schemas.openxmlformats.org/officeDocument/2006/customXml" ds:itemID="{93036CBA-D046-481A-8B9F-1275869D0315}">
-  <ds:schemaRefs>
-    <ds:schemaRef ds:uri="http://schemas.microsoft.com/office/2006/metadata/longProperties"/>
-  </ds:schemaRefs>
-</ds:datastoreItem>
-</file>
-
-<file path=customXml/itemProps3.xml><?xml version="1.0" encoding="utf-8"?>
-<ds:datastoreItem xmlns:ds="http://schemas.openxmlformats.org/officeDocument/2006/customXml" ds:itemID="{7CDD3D26-A7DC-4560-A2CE-6E0F058E4981}">
-  <ds:schemaRefs>
-    <ds:schemaRef ds:uri="http://schemas.microsoft.com/sharepoint/v3/contenttype/forms"/>
-  </ds:schemaRefs>
-</ds:datastoreItem>
-</file>
-
-<file path=customXml/itemProps4.xml><?xml version="1.0" encoding="utf-8"?>
-<ds:datastoreItem xmlns:ds="http://schemas.openxmlformats.org/officeDocument/2006/customXml" ds:itemID="{98FB6D17-09F9-4F00-B34F-6196AA42767C}">
-  <ds:schemaRefs>
-    <ds:schemaRef ds:uri="http://schemas.microsoft.com/sharepoint/events"/>
-  </ds:schemaRefs>
-</ds:datastoreItem>
-</file>
-
 <file path=customXml/itemProps5.xml><?xml version="1.0" encoding="utf-8"?>
 <ds:datastoreItem xmlns:ds="http://schemas.openxmlformats.org/officeDocument/2006/customXml" ds:itemID="{E4AE9093-D47C-4990-814B-67DDE1CB1120}">
   <ds:schemaRefs>

</xml_diff>